<commit_message>
Cloud model option: Claude (Opus default), Grok, OpenAI, or any OpenAI-compatible server
Same prompts, same four gateways, same audit log as the local Ollama path.
Keys from env only, never printed or logged. G1 egress check refuses any raw
sensitive value before every cloud call; store=false on the Responses API.
Every log line names backend and model. Stub tests for all four providers,
setup guide (.docx/.pdf) section 7.
</commit_message>
<xml_diff>
--- a/docs/Four-Gateways-Setup-Guide.docx
+++ b/docs/Four-Gateways-Setup-Guide.docx
@@ -23,7 +23,7 @@
         <w:rPr>
           <w:b/>
         </w:rPr>
-        <w:t>SYNTHETIC SAMPLE DATA ONLY. Every name, number, and ID in this kit is invented. The labs run fully offline, and nothing leaves your laptop.</w:t>
+        <w:t>SYNTHETIC SAMPLE DATA ONLY. Every name, number, and ID in this kit is invented. In mock mode and with a local model the labs run fully offline, and nothing leaves your laptop. The optional cloud model mode (section 7) sends redacted synthetic data to the provider you choose.</w:t>
       </w:r>
     </w:p>
     <w:p>
@@ -56,6 +56,14 @@
       </w:pPr>
       <w:r>
         <w:t>Optional local model through Ollama: llama3.1:8b or deepseek-r1:7b.</w:t>
+      </w:r>
+    </w:p>
+    <w:p>
+      <w:pPr>
+        <w:pStyle w:val="ListBullet"/>
+      </w:pPr>
+      <w:r>
+        <w:t>Optional cloud model with your own API key: Anthropic Claude (Opus by default), xAI Grok, OpenAI, or any OpenAI-compatible server. Paid per use.</w:t>
       </w:r>
     </w:p>
     <w:p>
@@ -661,7 +669,677 @@
         <w:pStyle w:val="Heading1"/>
       </w:pPr>
       <w:r>
-        <w:t>7. Walk through each lab</w:t>
+        <w:t>7. Cloud model option (optional, paid)</w:t>
+      </w:r>
+    </w:p>
+    <w:p>
+      <w:r>
+        <w:rPr>
+          <w:b w:val="0"/>
+        </w:rPr>
+        <w:t>Prefer Claude, Grok, or ChatGPT to a local model? The labs run the same way with a cloud model. Same prompts, same four gateways, same audit log. Only the model changes. You bring your own API key.</w:t>
+      </w:r>
+    </w:p>
+    <w:tbl>
+      <w:tblPr>
+        <w:tblStyle w:val="LightGrid-Accent1"/>
+        <w:tblW w:type="auto" w:w="0"/>
+        <w:tblLook w:firstColumn="1" w:firstRow="1" w:lastColumn="0" w:lastRow="0" w:noHBand="0" w:noVBand="1" w:val="04A0"/>
+      </w:tblPr>
+      <w:tblGrid>
+        <w:gridCol w:w="1728"/>
+        <w:gridCol w:w="1728"/>
+        <w:gridCol w:w="1728"/>
+        <w:gridCol w:w="1728"/>
+        <w:gridCol w:w="1728"/>
+      </w:tblGrid>
+      <w:tr>
+        <w:tc>
+          <w:tcPr>
+            <w:tcW w:type="dxa" w:w="1728"/>
+          </w:tcPr>
+          <w:p>
+            <w:r>
+              <w:rPr>
+                <w:b/>
+                <w:sz w:val="19"/>
+              </w:rPr>
+              <w:t>Backend</w:t>
+            </w:r>
+          </w:p>
+        </w:tc>
+        <w:tc>
+          <w:tcPr>
+            <w:tcW w:type="dxa" w:w="1728"/>
+          </w:tcPr>
+          <w:p>
+            <w:r>
+              <w:rPr>
+                <w:b/>
+                <w:sz w:val="19"/>
+              </w:rPr>
+              <w:t>Provider</w:t>
+            </w:r>
+          </w:p>
+        </w:tc>
+        <w:tc>
+          <w:tcPr>
+            <w:tcW w:type="dxa" w:w="1728"/>
+          </w:tcPr>
+          <w:p>
+            <w:r>
+              <w:rPr>
+                <w:b/>
+                <w:sz w:val="19"/>
+              </w:rPr>
+              <w:t>Key</w:t>
+            </w:r>
+          </w:p>
+        </w:tc>
+        <w:tc>
+          <w:tcPr>
+            <w:tcW w:type="dxa" w:w="1728"/>
+          </w:tcPr>
+          <w:p>
+            <w:r>
+              <w:rPr>
+                <w:b/>
+                <w:sz w:val="19"/>
+              </w:rPr>
+              <w:t>Default model</w:t>
+            </w:r>
+          </w:p>
+        </w:tc>
+        <w:tc>
+          <w:tcPr>
+            <w:tcW w:type="dxa" w:w="1728"/>
+          </w:tcPr>
+          <w:p>
+            <w:r>
+              <w:rPr>
+                <w:b/>
+                <w:sz w:val="19"/>
+              </w:rPr>
+              <w:t>Cost</w:t>
+            </w:r>
+          </w:p>
+        </w:tc>
+      </w:tr>
+      <w:tr>
+        <w:tc>
+          <w:tcPr>
+            <w:tcW w:type="dxa" w:w="1728"/>
+          </w:tcPr>
+          <w:p>
+            <w:r>
+              <w:rPr>
+                <w:sz w:val="19"/>
+              </w:rPr>
+              <w:t>mock</w:t>
+            </w:r>
+          </w:p>
+        </w:tc>
+        <w:tc>
+          <w:tcPr>
+            <w:tcW w:type="dxa" w:w="1728"/>
+          </w:tcPr>
+          <w:p>
+            <w:r>
+              <w:rPr>
+                <w:sz w:val="19"/>
+              </w:rPr>
+              <w:t>None, scripted</w:t>
+            </w:r>
+          </w:p>
+        </w:tc>
+        <w:tc>
+          <w:tcPr>
+            <w:tcW w:type="dxa" w:w="1728"/>
+          </w:tcPr>
+          <w:p>
+            <w:r>
+              <w:rPr>
+                <w:sz w:val="19"/>
+              </w:rPr>
+              <w:t>None</w:t>
+            </w:r>
+          </w:p>
+        </w:tc>
+        <w:tc>
+          <w:tcPr>
+            <w:tcW w:type="dxa" w:w="1728"/>
+          </w:tcPr>
+          <w:p>
+            <w:r>
+              <w:rPr>
+                <w:sz w:val="19"/>
+              </w:rPr>
+              <w:t>Scripted</w:t>
+            </w:r>
+          </w:p>
+        </w:tc>
+        <w:tc>
+          <w:tcPr>
+            <w:tcW w:type="dxa" w:w="1728"/>
+          </w:tcPr>
+          <w:p>
+            <w:r>
+              <w:rPr>
+                <w:sz w:val="19"/>
+              </w:rPr>
+              <w:t>Free</w:t>
+            </w:r>
+          </w:p>
+        </w:tc>
+      </w:tr>
+      <w:tr>
+        <w:tc>
+          <w:tcPr>
+            <w:tcW w:type="dxa" w:w="1728"/>
+          </w:tcPr>
+          <w:p>
+            <w:r>
+              <w:rPr>
+                <w:sz w:val="19"/>
+              </w:rPr>
+              <w:t>ollama</w:t>
+            </w:r>
+          </w:p>
+        </w:tc>
+        <w:tc>
+          <w:tcPr>
+            <w:tcW w:type="dxa" w:w="1728"/>
+          </w:tcPr>
+          <w:p>
+            <w:r>
+              <w:rPr>
+                <w:sz w:val="19"/>
+              </w:rPr>
+              <w:t>Your laptop</w:t>
+            </w:r>
+          </w:p>
+        </w:tc>
+        <w:tc>
+          <w:tcPr>
+            <w:tcW w:type="dxa" w:w="1728"/>
+          </w:tcPr>
+          <w:p>
+            <w:r>
+              <w:rPr>
+                <w:sz w:val="19"/>
+              </w:rPr>
+              <w:t>None</w:t>
+            </w:r>
+          </w:p>
+        </w:tc>
+        <w:tc>
+          <w:tcPr>
+            <w:tcW w:type="dxa" w:w="1728"/>
+          </w:tcPr>
+          <w:p>
+            <w:r>
+              <w:rPr>
+                <w:sz w:val="19"/>
+              </w:rPr>
+              <w:t>llama3.1:8b</w:t>
+            </w:r>
+          </w:p>
+        </w:tc>
+        <w:tc>
+          <w:tcPr>
+            <w:tcW w:type="dxa" w:w="1728"/>
+          </w:tcPr>
+          <w:p>
+            <w:r>
+              <w:rPr>
+                <w:sz w:val="19"/>
+              </w:rPr>
+              <w:t>Free</w:t>
+            </w:r>
+          </w:p>
+        </w:tc>
+      </w:tr>
+      <w:tr>
+        <w:tc>
+          <w:tcPr>
+            <w:tcW w:type="dxa" w:w="1728"/>
+          </w:tcPr>
+          <w:p>
+            <w:r>
+              <w:rPr>
+                <w:sz w:val="19"/>
+              </w:rPr>
+              <w:t>anthropic</w:t>
+            </w:r>
+          </w:p>
+        </w:tc>
+        <w:tc>
+          <w:tcPr>
+            <w:tcW w:type="dxa" w:w="1728"/>
+          </w:tcPr>
+          <w:p>
+            <w:r>
+              <w:rPr>
+                <w:sz w:val="19"/>
+              </w:rPr>
+              <w:t>Anthropic Claude</w:t>
+            </w:r>
+          </w:p>
+        </w:tc>
+        <w:tc>
+          <w:tcPr>
+            <w:tcW w:type="dxa" w:w="1728"/>
+          </w:tcPr>
+          <w:p>
+            <w:r>
+              <w:rPr>
+                <w:sz w:val="19"/>
+              </w:rPr>
+              <w:t>ANTHROPIC_API_KEY</w:t>
+            </w:r>
+          </w:p>
+        </w:tc>
+        <w:tc>
+          <w:tcPr>
+            <w:tcW w:type="dxa" w:w="1728"/>
+          </w:tcPr>
+          <w:p>
+            <w:r>
+              <w:rPr>
+                <w:sz w:val="19"/>
+              </w:rPr>
+              <w:t>claude-opus-5-5</w:t>
+            </w:r>
+          </w:p>
+        </w:tc>
+        <w:tc>
+          <w:tcPr>
+            <w:tcW w:type="dxa" w:w="1728"/>
+          </w:tcPr>
+          <w:p>
+            <w:r>
+              <w:rPr>
+                <w:sz w:val="19"/>
+              </w:rPr>
+              <w:t>Paid</w:t>
+            </w:r>
+          </w:p>
+        </w:tc>
+      </w:tr>
+      <w:tr>
+        <w:tc>
+          <w:tcPr>
+            <w:tcW w:type="dxa" w:w="1728"/>
+          </w:tcPr>
+          <w:p>
+            <w:r>
+              <w:rPr>
+                <w:sz w:val="19"/>
+              </w:rPr>
+              <w:t>xai</w:t>
+            </w:r>
+          </w:p>
+        </w:tc>
+        <w:tc>
+          <w:tcPr>
+            <w:tcW w:type="dxa" w:w="1728"/>
+          </w:tcPr>
+          <w:p>
+            <w:r>
+              <w:rPr>
+                <w:sz w:val="19"/>
+              </w:rPr>
+              <w:t>xAI Grok</w:t>
+            </w:r>
+          </w:p>
+        </w:tc>
+        <w:tc>
+          <w:tcPr>
+            <w:tcW w:type="dxa" w:w="1728"/>
+          </w:tcPr>
+          <w:p>
+            <w:r>
+              <w:rPr>
+                <w:sz w:val="19"/>
+              </w:rPr>
+              <w:t>XAI_API_KEY</w:t>
+            </w:r>
+          </w:p>
+        </w:tc>
+        <w:tc>
+          <w:tcPr>
+            <w:tcW w:type="dxa" w:w="1728"/>
+          </w:tcPr>
+          <w:p>
+            <w:r>
+              <w:rPr>
+                <w:sz w:val="19"/>
+              </w:rPr>
+              <w:t>grok-4.7</w:t>
+            </w:r>
+          </w:p>
+        </w:tc>
+        <w:tc>
+          <w:tcPr>
+            <w:tcW w:type="dxa" w:w="1728"/>
+          </w:tcPr>
+          <w:p>
+            <w:r>
+              <w:rPr>
+                <w:sz w:val="19"/>
+              </w:rPr>
+              <w:t>Paid</w:t>
+            </w:r>
+          </w:p>
+        </w:tc>
+      </w:tr>
+      <w:tr>
+        <w:tc>
+          <w:tcPr>
+            <w:tcW w:type="dxa" w:w="1728"/>
+          </w:tcPr>
+          <w:p>
+            <w:r>
+              <w:rPr>
+                <w:sz w:val="19"/>
+              </w:rPr>
+              <w:t>openai</w:t>
+            </w:r>
+          </w:p>
+        </w:tc>
+        <w:tc>
+          <w:tcPr>
+            <w:tcW w:type="dxa" w:w="1728"/>
+          </w:tcPr>
+          <w:p>
+            <w:r>
+              <w:rPr>
+                <w:sz w:val="19"/>
+              </w:rPr>
+              <w:t>OpenAI</w:t>
+            </w:r>
+          </w:p>
+        </w:tc>
+        <w:tc>
+          <w:tcPr>
+            <w:tcW w:type="dxa" w:w="1728"/>
+          </w:tcPr>
+          <w:p>
+            <w:r>
+              <w:rPr>
+                <w:sz w:val="19"/>
+              </w:rPr>
+              <w:t>OPENAI_API_KEY</w:t>
+            </w:r>
+          </w:p>
+        </w:tc>
+        <w:tc>
+          <w:tcPr>
+            <w:tcW w:type="dxa" w:w="1728"/>
+          </w:tcPr>
+          <w:p>
+            <w:r>
+              <w:rPr>
+                <w:sz w:val="19"/>
+              </w:rPr>
+              <w:t>gpt-6.1-sol</w:t>
+            </w:r>
+          </w:p>
+        </w:tc>
+        <w:tc>
+          <w:tcPr>
+            <w:tcW w:type="dxa" w:w="1728"/>
+          </w:tcPr>
+          <w:p>
+            <w:r>
+              <w:rPr>
+                <w:sz w:val="19"/>
+              </w:rPr>
+              <w:t>Paid</w:t>
+            </w:r>
+          </w:p>
+        </w:tc>
+      </w:tr>
+      <w:tr>
+        <w:tc>
+          <w:tcPr>
+            <w:tcW w:type="dxa" w:w="1728"/>
+          </w:tcPr>
+          <w:p>
+            <w:r>
+              <w:rPr>
+                <w:sz w:val="19"/>
+              </w:rPr>
+              <w:t>compatible</w:t>
+            </w:r>
+          </w:p>
+        </w:tc>
+        <w:tc>
+          <w:tcPr>
+            <w:tcW w:type="dxa" w:w="1728"/>
+          </w:tcPr>
+          <w:p>
+            <w:r>
+              <w:rPr>
+                <w:sz w:val="19"/>
+              </w:rPr>
+              <w:t>OpenAI-compatible server</w:t>
+            </w:r>
+          </w:p>
+        </w:tc>
+        <w:tc>
+          <w:tcPr>
+            <w:tcW w:type="dxa" w:w="1728"/>
+          </w:tcPr>
+          <w:p>
+            <w:r>
+              <w:rPr>
+                <w:sz w:val="19"/>
+              </w:rPr>
+              <w:t>FR_API_KEY</w:t>
+            </w:r>
+          </w:p>
+        </w:tc>
+        <w:tc>
+          <w:tcPr>
+            <w:tcW w:type="dxa" w:w="1728"/>
+          </w:tcPr>
+          <w:p>
+            <w:r>
+              <w:rPr>
+                <w:sz w:val="19"/>
+              </w:rPr>
+              <w:t>Set FR_MODEL</w:t>
+            </w:r>
+          </w:p>
+        </w:tc>
+        <w:tc>
+          <w:tcPr>
+            <w:tcW w:type="dxa" w:w="1728"/>
+          </w:tcPr>
+          <w:p>
+            <w:r>
+              <w:rPr>
+                <w:sz w:val="19"/>
+              </w:rPr>
+              <w:t>Depends</w:t>
+            </w:r>
+          </w:p>
+        </w:tc>
+      </w:tr>
+    </w:tbl>
+    <w:p>
+      <w:r>
+        <w:rPr>
+          <w:b/>
+        </w:rPr>
+        <w:t>Free vs paid</w:t>
+      </w:r>
+    </w:p>
+    <w:p>
+      <w:pPr>
+        <w:pStyle w:val="ListBullet"/>
+      </w:pPr>
+      <w:r>
+        <w:t>Free: mock mode (scripted) and Ollama (local model on your laptop). No key, no internet, nothing leaves the machine.</w:t>
+      </w:r>
+    </w:p>
+    <w:p>
+      <w:pPr>
+        <w:pStyle w:val="ListBullet"/>
+      </w:pPr>
+      <w:r>
+        <w:t>Paid: anthropic, xai, openai. Billed per token by the provider to your own account. A full run is four short calls, usually a few cents or less. Check the provider's pricing page.</w:t>
+      </w:r>
+    </w:p>
+    <w:p>
+      <w:pPr>
+        <w:pStyle w:val="ListBullet"/>
+      </w:pPr>
+      <w:r>
+        <w:t>compatible: any OpenAI-compatible server, such as OpenRouter, Azure, LM Studio, or vLLM. Cost depends on the server; a local server is free.</w:t>
+      </w:r>
+    </w:p>
+    <w:p>
+      <w:r>
+        <w:rPr>
+          <w:b/>
+        </w:rPr>
+        <w:t>Step 1: Get a key</w:t>
+      </w:r>
+    </w:p>
+    <w:p>
+      <w:pPr>
+        <w:pStyle w:val="ListBullet"/>
+      </w:pPr>
+      <w:r>
+        <w:t>Anthropic: console.anthropic.com, then API Keys. Set ANTHROPIC_API_KEY.</w:t>
+      </w:r>
+    </w:p>
+    <w:p>
+      <w:pPr>
+        <w:pStyle w:val="ListBullet"/>
+      </w:pPr>
+      <w:r>
+        <w:t>xAI: console.x.ai, then API Keys. Set XAI_API_KEY.</w:t>
+      </w:r>
+    </w:p>
+    <w:p>
+      <w:pPr>
+        <w:pStyle w:val="ListBullet"/>
+      </w:pPr>
+      <w:r>
+        <w:t>OpenAI: platform.openai.com, then API keys. Set OPENAI_API_KEY.</w:t>
+      </w:r>
+    </w:p>
+    <w:p>
+      <w:pPr>
+        <w:pStyle w:val="ListBullet"/>
+      </w:pPr>
+      <w:r>
+        <w:t>Keys are read from the environment at call time, sent only to the provider you picked, and never printed, logged, or saved by the labs. Never put a key in a file in this folder, and never commit one to Git.</w:t>
+      </w:r>
+    </w:p>
+    <w:p>
+      <w:r>
+        <w:rPr>
+          <w:b/>
+        </w:rPr>
+        <w:t>Step 2: Run it</w:t>
+      </w:r>
+    </w:p>
+    <w:p>
+      <w:r>
+        <w:rPr>
+          <w:rFonts w:ascii="Consolas" w:hAnsi="Consolas"/>
+          <w:color w:val="14202B"/>
+          <w:sz w:val="20"/>
+        </w:rPr>
+        <w:t>Mac:</w:t>
+        <w:br/>
+        <w:t xml:space="preserve">  export ANTHROPIC_API_KEY=your-key</w:t>
+        <w:br/>
+        <w:t xml:space="preserve">  FR_BACKEND=anthropic python3 run_all.py</w:t>
+        <w:br/>
+        <w:t xml:space="preserve">  FR_BACKEND=anthropic FR_MODEL=claude-sonnet-5-5 python3 run_all.py</w:t>
+        <w:br/>
+        <w:t xml:space="preserve">  FR_BACKEND=xai python3 run_all.py</w:t>
+        <w:br/>
+        <w:t xml:space="preserve">  FR_BACKEND=openai python3 run_all.py</w:t>
+        <w:br/>
+        <w:br/>
+        <w:t>Windows PowerShell:</w:t>
+        <w:br/>
+        <w:t xml:space="preserve">  $env:ANTHROPIC_API_KEY="your-key"; $env:FR_BACKEND="anthropic"; py run_all.py</w:t>
+        <w:br/>
+        <w:br/>
+        <w:t>OpenAI-compatible server:</w:t>
+        <w:br/>
+        <w:t xml:space="preserve">  FR_BACKEND=compatible FR_BASE_URL=https://openrouter.ai/api/v1 FR_MODEL=model-name FR_API_KEY=your-key python3 run_all.py</w:t>
+      </w:r>
+    </w:p>
+    <w:p>
+      <w:r>
+        <w:rPr>
+          <w:b/>
+        </w:rPr>
+        <w:t>Step 3: Switch back</w:t>
+      </w:r>
+    </w:p>
+    <w:p>
+      <w:r>
+        <w:rPr>
+          <w:b w:val="0"/>
+        </w:rPr>
+        <w:t>Free local model: set FR_BACKEND=ollama. Mock mode: remove FR_BACKEND (Mac: unset FR_BACKEND; PowerShell: Remove-Item Env:FR_BACKEND). FR_MODEL picks any model your account can use; the defaults are Claude Opus (claude-opus-5-5), Grok (grok-4.7), and OpenAI (gpt-6.1-sol; try gpt-6-astra for the flagship).</w:t>
+      </w:r>
+    </w:p>
+    <w:p>
+      <w:r>
+        <w:rPr>
+          <w:b/>
+        </w:rPr>
+        <w:t>Compare local and cloud side by side</w:t>
+      </w:r>
+    </w:p>
+    <w:p>
+      <w:r>
+        <w:rPr>
+          <w:b w:val="0"/>
+        </w:rPr>
+        <w:t>Every line in out/flight-recorder.jsonl now names the backend and model that ran. Run once with Ollama, copy the log, run once with a cloud model, and compare. The events line up one for one. A cloud run adds one "G1 CLOUD EGRESS CHECKED" line before each model call. The models write different drafts; the gates decide the outcome either way.</w:t>
+      </w:r>
+    </w:p>
+    <w:p>
+      <w:r>
+        <w:rPr>
+          <w:b/>
+        </w:rPr>
+        <w:t>Why this is a Gateway 1 decision</w:t>
+      </w:r>
+    </w:p>
+    <w:p>
+      <w:r>
+        <w:rPr>
+          <w:b w:val="0"/>
+        </w:rPr>
+        <w:t>A cloud run sends data to the provider. Here that data is SYNTHETIC SAMPLE DATA and already redacted. Before every call the code scans the outgoing text and refuses to send if any raw sensitive value (SSN, phone, email, name, date of birth, address, health note) is present. On the OpenAI and xAI Responses API it also asks the provider not to store the request (store: false). In your own systems, check the provider agreement for retention, training use, and region before any real data goes to a cloud model.</w:t>
+      </w:r>
+    </w:p>
+    <w:p>
+      <w:r>
+        <w:rPr>
+          <w:b w:val="0"/>
+        </w:rPr>
+        <w:t>Test the cloud path with no key and no internet: python3 tests/test_cloud.py runs every lab against a bundled stand-in for the Anthropic, Responses, and Chat Completions APIs, with the same misbehaving model the Ollama test uses. Add --real anthropic for one real, paid run. With make: make test-cloud.</w:t>
+      </w:r>
+    </w:p>
+    <w:p>
+      <w:pPr>
+        <w:pStyle w:val="Heading1"/>
+      </w:pPr>
+      <w:r>
+        <w:t>8. Walk through each lab</w:t>
       </w:r>
     </w:p>
     <w:p>
@@ -773,7 +1451,7 @@
         <w:pStyle w:val="Heading1"/>
       </w:pPr>
       <w:r>
-        <w:t>8. Open the clickable demo</w:t>
+        <w:t>9. Open the clickable demo</w:t>
       </w:r>
     </w:p>
     <w:p>
@@ -805,7 +1483,7 @@
         <w:pStyle w:val="Heading1"/>
       </w:pPr>
       <w:r>
-        <w:t>9. Troubleshooting</w:t>
+        <w:t>10. Troubleshooting</w:t>
       </w:r>
     </w:p>
     <w:p>
@@ -950,10 +1628,65 @@
     </w:p>
     <w:p>
       <w:pPr>
+        <w:pStyle w:val="ListBullet"/>
+      </w:pPr>
+      <w:r>
+        <w:rPr>
+          <w:b/>
+        </w:rPr>
+        <w:t>"needs an API key": Set the key variable named in the message in the same terminal, or remove FR_BACKEND to use mock mode.</w:t>
+      </w:r>
+    </w:p>
+    <w:p>
+      <w:pPr>
+        <w:pStyle w:val="ListBullet"/>
+      </w:pPr>
+      <w:r>
+        <w:rPr>
+          <w:b/>
+        </w:rPr>
+        <w:t>HTTP 401 or 403 from a cloud provider: The key was rejected or cannot use that model. Make a new key, or pick another model with FR_MODEL.</w:t>
+      </w:r>
+    </w:p>
+    <w:p>
+      <w:pPr>
+        <w:pStyle w:val="ListBullet"/>
+      </w:pPr>
+      <w:r>
+        <w:rPr>
+          <w:b/>
+        </w:rPr>
+        <w:t>HTTP 404 from a cloud provider: The model name is wrong for your account. Set FR_MODEL to a model listed in the provider's console.</w:t>
+      </w:r>
+    </w:p>
+    <w:p>
+      <w:pPr>
+        <w:pStyle w:val="ListBullet"/>
+      </w:pPr>
+      <w:r>
+        <w:rPr>
+          <w:b/>
+        </w:rPr>
+        <w:t>HTTP 429 from a cloud provider: Rate limit or no credits left. Add credits or wait a minute.</w:t>
+      </w:r>
+    </w:p>
+    <w:p>
+      <w:pPr>
+        <w:pStyle w:val="ListBullet"/>
+      </w:pPr>
+      <w:r>
+        <w:rPr>
+          <w:b/>
+        </w:rPr>
+        <w:t>"Refusing to send: the outgoing text contains sensitive data": Gateway 1 working. Something unredacted was about to leave the machine, so nothing was sent.</w:t>
+      </w:r>
+    </w:p>
+    <w:p>
+      <w:pPr>
         <w:pStyle w:val="Heading1"/>
       </w:pPr>
       <w:r>
-        <w:t>10. Data handling</w:t>
+        <w:t>11. Data handling</w:t>
       </w:r>
     </w:p>
     <w:p>
@@ -969,7 +1702,7 @@
         <w:pStyle w:val="ListBullet"/>
       </w:pPr>
       <w:r>
-        <w:t>Mock mode makes no network calls. Ollama mode calls only localhost; the code refuses any other host.</w:t>
+        <w:t>Mock mode makes no network calls. Ollama mode calls only localhost; the code refuses any other host. Cloud mode calls only the provider you picked, sends only redacted synthetic data, and refuses to send any raw sensitive value.</w:t>
       </w:r>
     </w:p>
     <w:p>
@@ -1001,7 +1734,7 @@
         <w:pStyle w:val="Heading1"/>
       </w:pPr>
       <w:r>
-        <w:t>11. Use it in your own product</w:t>
+        <w:t>12. Use it in your own product</w:t>
       </w:r>
     </w:p>
     <w:p>

</xml_diff>

<commit_message>
Cloud option: Grok source tags after the period no longer trip G3; guide gets free vs paid choice, per-run cost, Mac and Windows key steps
- G3 trace_ok moves a source tag that follows the period back into its sentence (real grok-4.7 output does this); unit test plus Grok-style stub replies in test_cloud
- Default FR_MAX_TOKENS 16000 so always-on thinking (Claude Opus 5.5) and reasoning tokens cannot truncate the reply
- Setup guide (docx and pdf) and READMEs: explicit pick-one free local vs paid cloud, rough cost per run per model, PowerShell and Command Prompt steps for every provider, Lincoln NE, seven unit tests
</commit_message>
<xml_diff>
--- a/docs/Four-Gateways-Setup-Guide.docx
+++ b/docs/Four-Gateways-Setup-Guide.docx
@@ -15,7 +15,7 @@
         <w:rPr>
           <w:b w:val="0"/>
         </w:rPr>
-        <w:t>Run the Flight Recorder demo and the four gateways labs on your own Mac or Windows laptop. DAMA Rocky Mountain, October 2026. Nathan Platter, Lincoln, NE.</w:t>
+        <w:t>Run the Flight Recorder demo and the four gateways labs on your own Mac or Windows laptop. DAMA Rocky Mountain, October 2026. Nathan Platter, Lincoln NE.</w:t>
       </w:r>
     </w:p>
     <w:p>
@@ -614,7 +614,7 @@
         </w:rPr>
         <w:t>PASS G1 no sensitive value leaves</w:t>
         <w:br/>
-        <w:t>PASS G2 injected money move blocked</w:t>
+        <w:t>PASS G2 injection never moves money</w:t>
         <w:br/>
         <w:t>PASS G3 out-of-role doc denied</w:t>
         <w:br/>
@@ -626,7 +626,7 @@
         <w:rPr>
           <w:b w:val="0"/>
         </w:rPr>
-        <w:t>Run the tests: python3 -m unittest -v test_gateways (Windows: py -m unittest -v test_gateways). Six tests should pass.</w:t>
+        <w:t>Run the tests: python3 -m unittest -v test_gateways (Windows: py -m unittest -v test_gateways). Seven tests should pass.</w:t>
       </w:r>
     </w:p>
     <w:p>
@@ -677,7 +677,7 @@
         <w:rPr>
           <w:b w:val="0"/>
         </w:rPr>
-        <w:t>Prefer Claude, Grok, or ChatGPT to a local model? The labs run the same way with a cloud model. Same prompts, same four gateways, same audit log. Only the model changes. You bring your own API key.</w:t>
+        <w:t>Two versions, both run live, same labs: the free local version (Ollama on your laptop) and the paid cloud version (Claude, Grok, or ChatGPT with your own API key). Same prompts, same four gateways, same audit log. Only the model changes.</w:t>
       </w:r>
     </w:p>
     <w:tbl>
@@ -961,7 +961,7 @@
               <w:rPr>
                 <w:sz w:val="19"/>
               </w:rPr>
-              <w:t>Paid</w:t>
+              <w:t>Paid, about 5 to 15 cents a run</w:t>
             </w:r>
           </w:p>
         </w:tc>
@@ -1028,7 +1028,7 @@
               <w:rPr>
                 <w:sz w:val="19"/>
               </w:rPr>
-              <w:t>Paid</w:t>
+              <w:t>Paid, about 1 to 5 cents a run</w:t>
             </w:r>
           </w:p>
         </w:tc>
@@ -1095,7 +1095,7 @@
               <w:rPr>
                 <w:sz w:val="19"/>
               </w:rPr>
-              <w:t>Paid</w:t>
+              <w:t>Paid, about 2 to 8 cents a run</w:t>
             </w:r>
           </w:p>
         </w:tc>
@@ -1162,7 +1162,7 @@
               <w:rPr>
                 <w:sz w:val="19"/>
               </w:rPr>
-              <w:t>Depends</w:t>
+              <w:t>Depends on the server</w:t>
             </w:r>
           </w:p>
         </w:tc>
@@ -1173,7 +1173,7 @@
         <w:rPr>
           <w:b/>
         </w:rPr>
-        <w:t>Free vs paid</w:t>
+        <w:t>Pick one: free local or paid cloud</w:t>
       </w:r>
     </w:p>
     <w:p>
@@ -1181,7 +1181,7 @@
         <w:pStyle w:val="ListBullet"/>
       </w:pPr>
       <w:r>
-        <w:t>Free: mock mode (scripted) and Ollama (local model on your laptop). No key, no internet, nothing leaves the machine.</w:t>
+        <w:t>Free local: mock mode (scripted, no install) or Ollama (a local model, section 6). No account, no key, nothing leaves the laptop. Cost: $0. Pick this if you can install Ollama, or if your laptop has 8 GB of RAM or more and you want to keep everything offline.</w:t>
       </w:r>
     </w:p>
     <w:p>
@@ -1189,7 +1189,7 @@
         <w:pStyle w:val="ListBullet"/>
       </w:pPr>
       <w:r>
-        <w:t>Paid: anthropic, xai, openai. Billed per token by the provider to your own account. A full run is four short calls, usually a few cents or less. Check the provider's pricing page.</w:t>
+        <w:t>Paid cloud: anthropic (Claude Opus), xai (Grok), or openai (ChatGPT models). Pick this if you cannot install Ollama, your laptop is slow, or you want a frontier model. You need an account with the provider, a payment method, and an API key; you pay the provider per token. A full run is four calls, about 500 tokens in plus the reply and the model's thinking. Rough cost per full run: Claude Opus 5.5 about 5 to 15 cents; Grok 4.7 about 1 to 5 cents; GPT-6.1 Sol about 2 to 8 cents; GPT-6 Astra about 10 to 40 cents. Prices as of October 2026; check the provider's pricing page.</w:t>
       </w:r>
     </w:p>
     <w:p>
@@ -1237,7 +1237,7 @@
         <w:pStyle w:val="ListBullet"/>
       </w:pPr>
       <w:r>
-        <w:t>Keys are read from the environment at call time, sent only to the provider you picked, and never printed, logged, or saved by the labs. Never put a key in a file in this folder, and never commit one to Git.</w:t>
+        <w:t>Keys are read from the environment at call time, sent only to the provider you picked, and never printed, logged, or saved by the labs. A key set this way lasts only for that terminal window; open a new window and set it again. Never put a key in a file in this folder, and never commit one to Git.</w:t>
       </w:r>
     </w:p>
     <w:p>
@@ -1255,7 +1255,7 @@
           <w:color w:val="14202B"/>
           <w:sz w:val="20"/>
         </w:rPr>
-        <w:t>Mac:</w:t>
+        <w:t>Mac (Terminal):</w:t>
         <w:br/>
         <w:t xml:space="preserve">  export ANTHROPIC_API_KEY=your-key</w:t>
         <w:br/>
@@ -1263,19 +1263,44 @@
         <w:br/>
         <w:t xml:space="preserve">  FR_BACKEND=anthropic FR_MODEL=claude-sonnet-5-5 python3 run_all.py</w:t>
         <w:br/>
+        <w:t xml:space="preserve">  export XAI_API_KEY=your-key</w:t>
+        <w:br/>
         <w:t xml:space="preserve">  FR_BACKEND=xai python3 run_all.py</w:t>
+        <w:br/>
+        <w:t xml:space="preserve">  export OPENAI_API_KEY=your-key</w:t>
         <w:br/>
         <w:t xml:space="preserve">  FR_BACKEND=openai python3 run_all.py</w:t>
         <w:br/>
         <w:br/>
-        <w:t>Windows PowerShell:</w:t>
+        <w:t>Windows (PowerShell):</w:t>
         <w:br/>
-        <w:t xml:space="preserve">  $env:ANTHROPIC_API_KEY="your-key"; $env:FR_BACKEND="anthropic"; py run_all.py</w:t>
+        <w:t xml:space="preserve">  $env:ANTHROPIC_API_KEY="your-key"</w:t>
+        <w:br/>
+        <w:t xml:space="preserve">  $env:FR_BACKEND="anthropic"</w:t>
+        <w:br/>
+        <w:t xml:space="preserve">  py run_all.py</w:t>
+        <w:br/>
+        <w:t xml:space="preserve">  # Grok:   $env:XAI_API_KEY="your-key";    $env:FR_BACKEND="xai"</w:t>
+        <w:br/>
+        <w:t xml:space="preserve">  # OpenAI: $env:OPENAI_API_KEY="your-key"; $env:FR_BACKEND="openai"</w:t>
+        <w:br/>
+        <w:br/>
+        <w:t>Windows (Command Prompt):</w:t>
+        <w:br/>
+        <w:t xml:space="preserve">  set ANTHROPIC_API_KEY=your-key</w:t>
+        <w:br/>
+        <w:t xml:space="preserve">  set FR_BACKEND=anthropic</w:t>
+        <w:br/>
+        <w:t xml:space="preserve">  py run_all.py</w:t>
         <w:br/>
         <w:br/>
         <w:t>OpenAI-compatible server:</w:t>
         <w:br/>
-        <w:t xml:space="preserve">  FR_BACKEND=compatible FR_BASE_URL=https://openrouter.ai/api/v1 FR_MODEL=model-name FR_API_KEY=your-key python3 run_all.py</w:t>
+        <w:t xml:space="preserve">  export FR_API_KEY=your-key</w:t>
+        <w:br/>
+        <w:t xml:space="preserve">  FR_BACKEND=compatible FR_BASE_URL=https://openrouter.ai/api/v1 \</w:t>
+        <w:br/>
+        <w:t xml:space="preserve">    FR_MODEL=model-name python3 run_all.py</w:t>
       </w:r>
     </w:p>
     <w:p>
@@ -1291,7 +1316,7 @@
         <w:rPr>
           <w:b w:val="0"/>
         </w:rPr>
-        <w:t>Free local model: set FR_BACKEND=ollama. Mock mode: remove FR_BACKEND (Mac: unset FR_BACKEND; PowerShell: Remove-Item Env:FR_BACKEND). FR_MODEL picks any model your account can use; the defaults are Claude Opus (claude-opus-5-5), Grok (grok-4.7), and OpenAI (gpt-6.1-sol; try gpt-6-astra for the flagship).</w:t>
+        <w:t>Free local model: set FR_BACKEND=ollama. Mock mode: remove FR_BACKEND (Mac: unset FR_BACKEND; PowerShell: Remove-Item Env:FR_BACKEND; Command Prompt: set FR_BACKEND=). FR_MODEL picks any model your account can use; the defaults are Claude Opus 5.5 (claude-opus-5-5), Grok 4.7 (grok-4.7), and GPT-6.1 Sol (gpt-6.1-sol; try gpt-6-astra for the OpenAI flagship). Cloud models think before they answer, so expect about 5 to 30 seconds per call.</w:t>
       </w:r>
     </w:p>
     <w:p>
@@ -1331,7 +1356,7 @@
         <w:rPr>
           <w:b w:val="0"/>
         </w:rPr>
-        <w:t>Test the cloud path with no key and no internet: python3 tests/test_cloud.py runs every lab against a bundled stand-in for the Anthropic, Responses, and Chat Completions APIs, with the same misbehaving model the Ollama test uses. Add --real anthropic for one real, paid run. With make: make test-cloud.</w:t>
+        <w:t>Test the cloud path with no key and no internet: python3 tests/test_cloud.py runs every lab against a bundled stand-in for the Anthropic, Responses, and Chat Completions APIs, with the same misbehaving model the Ollama test uses. Add --real anthropic (or --real xai, --real openai) for one real, paid run. With make: make test-cloud.</w:t>
       </w:r>
     </w:p>
     <w:p>

</xml_diff>

<commit_message>
Repair setup guide links and test instructions
</commit_message>
<xml_diff>
--- a/docs/Four-Gateways-Setup-Guide.docx
+++ b/docs/Four-Gateways-Setup-Guide.docx
@@ -394,7 +394,35 @@
         <w:rPr>
           <w:b w:val="0"/>
         </w:rPr>
-        <w:t>If Python is missing: on Mac, install it from python.org/downloads (or run xcode-select --install). On Windows, install it from python.org/downloads and tick "Add python.exe to PATH", or run:</w:t>
+        <w:t xml:space="preserve">If Python is missing: on Mac, install it from </w:t>
+      </w:r>
+      <w:hyperlink r:id="rIdAudit1">
+        <w:r>
+          <w:rPr>
+            <w:b w:val="0"/>
+          </w:rPr>
+          <w:t xml:space="preserve">python.org/downloads</w:t>
+        </w:r>
+      </w:hyperlink>
+      <w:r>
+        <w:rPr>
+          <w:b w:val="0"/>
+        </w:rPr>
+        <w:t xml:space="preserve"> (or run xcode-select --install). On Windows, install it from </w:t>
+      </w:r>
+      <w:hyperlink r:id="rIdAudit2">
+        <w:r>
+          <w:rPr>
+            <w:b w:val="0"/>
+          </w:rPr>
+          <w:t xml:space="preserve">python.org/downloads</w:t>
+        </w:r>
+      </w:hyperlink>
+      <w:r>
+        <w:rPr>
+          <w:b w:val="0"/>
+        </w:rPr>
+        <w:t xml:space="preserve"> and tick "Add python.exe to PATH", or run:</w:t>
       </w:r>
     </w:p>
     <w:p>
@@ -436,7 +464,15 @@
         <w:pStyle w:val="ListBullet"/>
       </w:pPr>
       <w:r>
-        <w:t>Download Ollama for macOS from ollama.com/download.</w:t>
+        <w:t xml:space="preserve">Download Ollama for macOS from </w:t>
+      </w:r>
+      <w:hyperlink r:id="rIdAudit3">
+        <w:r>
+          <w:t xml:space="preserve">ollama.com/download</w:t>
+        </w:r>
+      </w:hyperlink>
+      <w:r>
+        <w:t xml:space="preserve">.</w:t>
       </w:r>
     </w:p>
     <w:p>
@@ -460,7 +496,15 @@
         <w:pStyle w:val="ListBullet"/>
       </w:pPr>
       <w:r>
-        <w:t>Download OllamaSetup.exe from ollama.com/download and run it. No administrator rights are needed.</w:t>
+        <w:t xml:space="preserve">Download OllamaSetup.exe from </w:t>
+      </w:r>
+      <w:hyperlink r:id="rIdAudit4">
+        <w:r>
+          <w:t xml:space="preserve">ollama.com/download</w:t>
+        </w:r>
+      </w:hyperlink>
+      <w:r>
+        <w:t xml:space="preserve"> and run it. No administrator rights are needed.</w:t>
       </w:r>
     </w:p>
     <w:p>
@@ -498,7 +542,21 @@
         <w:rPr>
           <w:b w:val="0"/>
         </w:rPr>
-        <w:t>Quick test: ollama run llama3.1:8b "Say hello in five words." The local API listens on http://localhost:11434.</w:t>
+        <w:t xml:space="preserve">Quick test: ollama run llama3.1:8b "Say hello in five words." The local API listens on </w:t>
+      </w:r>
+      <w:hyperlink r:id="rIdAudit5">
+        <w:r>
+          <w:rPr>
+            <w:b w:val="0"/>
+          </w:rPr>
+          <w:t xml:space="preserve">http://localhost:11434</w:t>
+        </w:r>
+      </w:hyperlink>
+      <w:r>
+        <w:rPr>
+          <w:b w:val="0"/>
+        </w:rPr>
+        <w:t xml:space="preserve">.</w:t>
       </w:r>
     </w:p>
     <w:p>
@@ -534,7 +592,21 @@
         <w:rPr>
           <w:b w:val="0"/>
         </w:rPr>
-        <w:t>Without Git: open github.com/nathanplatteruser/dama-rocky-mountain-2026, click Code, then Download ZIP. Unzip it and open a terminal in the unzipped folder.</w:t>
+        <w:t xml:space="preserve">Without Git: open </w:t>
+      </w:r>
+      <w:hyperlink r:id="rIdAudit6">
+        <w:r>
+          <w:rPr>
+            <w:b w:val="0"/>
+          </w:rPr>
+          <w:t xml:space="preserve">github.com/nathanplatteruser/dama-rocky-mountain-2026</w:t>
+        </w:r>
+      </w:hyperlink>
+      <w:r>
+        <w:rPr>
+          <w:b w:val="0"/>
+        </w:rPr>
+        <w:t xml:space="preserve">, click Code, then Download ZIP. Unzip it and open a terminal in the unzipped folder.</w:t>
       </w:r>
     </w:p>
     <w:p>
@@ -626,7 +698,7 @@
         <w:rPr>
           <w:b w:val="0"/>
         </w:rPr>
-        <w:t>Run the tests: python3 -m unittest -v test_gateways (Windows: py -m unittest -v test_gateways). Seven tests should pass.</w:t>
+        <w:t>Run the tests: python3 -m unittest -v test_gateways (Windows: py -m unittest -v test_gateways). Eleven tests should pass.</w:t>
       </w:r>
     </w:p>
     <w:p>
@@ -1213,7 +1285,15 @@
         <w:pStyle w:val="ListBullet"/>
       </w:pPr>
       <w:r>
-        <w:t>Anthropic: console.anthropic.com, then API Keys. Set ANTHROPIC_API_KEY.</w:t>
+        <w:t xml:space="preserve">Anthropic: </w:t>
+      </w:r>
+      <w:hyperlink r:id="rIdAudit7">
+        <w:r>
+          <w:t xml:space="preserve">console.anthropic.com</w:t>
+        </w:r>
+      </w:hyperlink>
+      <w:r>
+        <w:t xml:space="preserve">, then API Keys. Set ANTHROPIC_API_KEY.</w:t>
       </w:r>
     </w:p>
     <w:p>
@@ -1221,7 +1301,15 @@
         <w:pStyle w:val="ListBullet"/>
       </w:pPr>
       <w:r>
-        <w:t>xAI: console.x.ai, then API Keys. Set XAI_API_KEY.</w:t>
+        <w:t xml:space="preserve">xAI: </w:t>
+      </w:r>
+      <w:hyperlink r:id="rIdAudit8">
+        <w:r>
+          <w:t xml:space="preserve">console.x.ai</w:t>
+        </w:r>
+      </w:hyperlink>
+      <w:r>
+        <w:t xml:space="preserve">, then API Keys. Set XAI_API_KEY.</w:t>
       </w:r>
     </w:p>
     <w:p>
@@ -1229,7 +1317,15 @@
         <w:pStyle w:val="ListBullet"/>
       </w:pPr>
       <w:r>
-        <w:t>OpenAI: platform.openai.com, then API keys. Set OPENAI_API_KEY.</w:t>
+        <w:t xml:space="preserve">OpenAI: </w:t>
+      </w:r>
+      <w:hyperlink r:id="rIdAudit9">
+        <w:r>
+          <w:t xml:space="preserve">platform.openai.com</w:t>
+        </w:r>
+      </w:hyperlink>
+      <w:r>
+        <w:t xml:space="preserve">, then API keys. Set OPENAI_API_KEY.</w:t>
       </w:r>
     </w:p>
     <w:p>
@@ -1356,7 +1452,7 @@
         <w:rPr>
           <w:b w:val="0"/>
         </w:rPr>
-        <w:t>Test the cloud path with no key and no internet: python3 tests/test_cloud.py runs every lab against a bundled stand-in for the Anthropic, Responses, and Chat Completions APIs, with the same misbehaving model the Ollama test uses. Add --real anthropic (or --real xai, --real openai) for one real, paid run. With make: make test-cloud.</w:t>
+        <w:t>Test the cloud path with no key and no internet: From the repository root, python3 tests/test_cloud.py runs every lab against a bundled stand-in for the Anthropic, Responses, and Chat Completions APIs, with the same misbehaving model the Ollama test uses. Add --real anthropic (or --real xai, --real openai) for one real, paid run. With make: make test-cloud.</w:t>
       </w:r>
     </w:p>
     <w:p>
@@ -1484,8 +1580,13 @@
         <w:pStyle w:val="ListBullet"/>
       </w:pPr>
       <w:r>
-        <w:t>Open flight-recorder/index.html in your browser (double-click works), or use the live link: nathanplatteruser.github.io/dama-rocky-mountain-2026/flight-recorder/</w:t>
+        <w:t xml:space="preserve">Open flight-recorder/index.html in your browser (double-click works), or use the live link: </w:t>
       </w:r>
+      <w:hyperlink r:id="rIdAudit10">
+        <w:r>
+          <w:t xml:space="preserve">nathanplatteruser.github.io/dama-rocky-mountain-2026/flight-recorder/</w:t>
+        </w:r>
+      </w:hyperlink>
     </w:p>
     <w:p>
       <w:pPr>
@@ -1533,7 +1634,21 @@
         <w:rPr>
           <w:b/>
         </w:rPr>
-        <w:t xml:space="preserve">"Could not reach Ollama at http://localhost:11434": </w:t>
+        <w:t xml:space="preserve">"Could not reach Ollama at </w:t>
+      </w:r>
+      <w:hyperlink r:id="rIdAudit11">
+        <w:r>
+          <w:rPr>
+            <w:b/>
+          </w:rPr>
+          <w:t xml:space="preserve">http://localhost:11434":</w:t>
+        </w:r>
+      </w:hyperlink>
+      <w:r>
+        <w:rPr>
+          <w:b/>
+        </w:rPr>
+        <w:t xml:space="preserve"> </w:t>
       </w:r>
       <w:r>
         <w:t>Start the Ollama app, or run ollama serve in another terminal. Or unset FR_BACKEND to go back to mock mode.</w:t>
@@ -1634,7 +1749,7 @@
         <w:t xml:space="preserve">Test the Ollama path without downloading a model: </w:t>
       </w:r>
       <w:r>
-        <w:t>python3 tests/test_ollama.py starts a small stand-in for the Ollama API and runs every lab as llama3.1:8b and deepseek-r1:7b, including a "bad" model that obeys the injection, invents numbers, and echoes an SSN. All gates should still pass. Add --real llama3.1:8b to also run against your real Ollama. With make installed: make test-ollama.</w:t>
+        <w:t>from the repository root, python3 tests/test_ollama.py starts a small stand-in for the Ollama API and runs every lab as llama3.1:8b and deepseek-r1:7b, including a "bad" model that obeys the injection, invents numbers, and echoes an SSN. All gates should still pass. Add --real llama3.1:8b to also run against your real Ollama. With make installed: make test-ollama.</w:t>
       </w:r>
     </w:p>
     <w:p>

</xml_diff>